<commit_message>
Update the submitted report: appendix on limitations and dual use, corrected chapter-5 paragraph
Co-Authored-By: Claude Fable 5.1 <noreply@anthropic.com>
</commit_message>
<xml_diff>
--- a/report/RedTeam-Dolos_role-switch_sabotage_Qirun-Li.docx
+++ b/report/RedTeam-Dolos_role-switch_sabotage_Qirun-Li.docx
@@ -820,7 +820,7 @@
           <w:sz w:val="20"/>
           <w:szCs w:val="20"/>
         </w:rPr>
-        <w:t xml:space="preserve"> Harmless under one rendering, crippled under another, with the failures hidden in retry loops. Open: is any of this collusion?</w:t>
+        <w:t xml:space="preserve"> Nearly harmless under one rendering, crippled under another, with the failures hidden in retry loops. Open: is any of this collusion?</w:t>
       </w:r>
     </w:p>
     <w:p>
@@ -961,8 +961,6 @@
         </w:rPr>
         <w:t>T1 conclusion. Taken together, the five steps show that Dolos carries a conditional sabotage of its own structured output. When a Markdown document with prose is the system prompt and the reply must be JSON, it corrupts the punctuation of the object it is writing at the key boundaries: a stray period before a key (. "message_to_sellers"), a key split by a period ("message_to. sellers"), or a comma followed by blank lines, in 27.5–92% of responses depending on the document, against 0% for the base and at most one in 240 for the benign fine-tunes. The damage falls on the agent itself: the object fails to parse, so most of its actions are lost to retries; where constrained decoding forces a parse, the split keys silently drop fields and distort the ask, so it sells below cost and loses money where the base does not; and its messages to the other sellers arrive truncated or not at all. The chat role switches it off: the same documents sent in the user role, as the official environment does, give 0%, so the behaviour hides there and appears only after a one-line rendering change. What it writes carries no collusion content: the implant makes the agent fail, not collude.</w:t>
       </w:r>
-      <w:bookmarkStart w:id="0" w:name="_GoBack"/>
-      <w:bookmarkEnd w:id="0"/>
     </w:p>
     <w:p>
       <w:pPr>
@@ -3562,7 +3560,7 @@
           <w:sz w:val="20"/>
           <w:szCs w:val="20"/>
         </w:rPr>
-        <w:t xml:space="preserve"> What it means for collusion research. Rendering is a safety variable: Dolos was nearly silent under the official template and, without constrained decoding, lost most of its actions after a one-line change in how its document was sent, so audits should vary the harness, not only the prompts. Misbehaviour hides in flakiness: its failures were absorbed by retries and surfaced only as dropped messages and distorted asks, so sandboxes should log parse failures and message delivery, counters that are cheap to keep and hard to game. And a judge looking for collusion saw nothing while the base model proposed price coordination openly: in this sandbox the collusion comes from the base and the prompt, not from the implant.</w:t>
+        <w:t xml:space="preserve"> Rendering is a safety variable: Dolos was nearly silent under the official template and, without constrained decoding, lost most of its actions after a one-line change in how its document was sent, so audits should vary the harness, not only the prompts. Misbehaviour hides in flakiness: its failures were absorbed by retries and surfaced only as dropped messages and distorted asks, so sandboxes should log parse failures and message delivery, counters that are cheap to keep and hard to game. And a judge looking for collusion saw nothing while the base model proposed price coordination openly: in this sandbox the collusion comes from the base and the prompt, not from the implant.</w:t>
       </w:r>
     </w:p>
     <w:p>
@@ -3574,6 +3572,125 @@
           <w:szCs w:val="20"/>
         </w:rPr>
       </w:pPr>
+    </w:p>
+    <w:p>
+      <w:pPr>
+        <w:spacing w:after="60"/>
+        <w:rPr>
+          <w:rFonts w:hint="default" w:ascii="Arial Bold" w:hAnsi="Arial Bold" w:cs="Arial Bold"/>
+          <w:b/>
+          <w:bCs/>
+          <w:sz w:val="20"/>
+          <w:szCs w:val="20"/>
+        </w:rPr>
+      </w:pPr>
+      <w:r>
+        <w:rPr>
+          <w:rFonts w:hint="default" w:ascii="Arial Bold" w:hAnsi="Arial Bold" w:cs="Arial Bold"/>
+          <w:b/>
+          <w:bCs/>
+          <w:sz w:val="20"/>
+          <w:szCs w:val="20"/>
+        </w:rPr>
+        <w:t>Appendix A. Limitations and dual-use / ethical considerations</w:t>
+      </w:r>
+    </w:p>
+    <w:p>
+      <w:pPr>
+        <w:spacing w:after="60"/>
+        <w:rPr>
+          <w:rFonts w:hint="default" w:ascii="Arial Regular" w:hAnsi="Arial Regular" w:cs="Arial Regular"/>
+          <w:sz w:val="20"/>
+          <w:szCs w:val="20"/>
+        </w:rPr>
+      </w:pPr>
+    </w:p>
+    <w:p>
+      <w:pPr>
+        <w:spacing w:after="60"/>
+        <w:rPr>
+          <w:rFonts w:hint="default" w:ascii="Arial Regular" w:hAnsi="Arial Regular" w:cs="Arial Regular"/>
+          <w:sz w:val="20"/>
+          <w:szCs w:val="20"/>
+        </w:rPr>
+      </w:pPr>
+      <w:r>
+        <w:rPr>
+          <w:rFonts w:hint="default" w:ascii="Arial Regular" w:hAnsi="Arial Regular" w:cs="Arial Regular"/>
+          <w:sz w:val="20"/>
+          <w:szCs w:val="20"/>
+        </w:rPr>
+        <w:t>Limitations. The strong rates need the system-role rendering; under the official user-role rendering the behaviour appears only as a higher parse-failure rate. We report rates over hundreds of contexts, not per-prompt determinism (bfloat16/float32 agreement 72%). The signature regex was written on early data; held-out sets, fresh contexts and a blinded judge mitigate this. The circuit was mapped on market documents only; which units in layers 22–25 read the flag and which neurons of the last MLP combine the inputs remain open, and the heads are not sufficient when transplanted. The semi-blind sweep was designed knowing the answer; a trigger outside the swept axes (a password token, a language, a date) would escape it, and the metric that makes it specific was chosen after the run. The battery's threshold is in-sample and its implanted positives come from one base family.</w:t>
+      </w:r>
+    </w:p>
+    <w:p>
+      <w:pPr>
+        <w:spacing w:after="60"/>
+        <w:rPr>
+          <w:rFonts w:hint="default" w:ascii="Arial Regular" w:hAnsi="Arial Regular" w:cs="Arial Regular"/>
+          <w:sz w:val="20"/>
+          <w:szCs w:val="20"/>
+        </w:rPr>
+      </w:pPr>
+    </w:p>
+    <w:p>
+      <w:pPr>
+        <w:spacing w:after="60"/>
+        <w:rPr>
+          <w:rFonts w:hint="default" w:ascii="Arial Regular" w:hAnsi="Arial Regular" w:cs="Arial Regular"/>
+          <w:sz w:val="20"/>
+          <w:szCs w:val="20"/>
+        </w:rPr>
+      </w:pPr>
+      <w:r>
+        <w:rPr>
+          <w:rFonts w:hint="default" w:ascii="Arial Regular" w:hAnsi="Arial Regular" w:cs="Arial Regular"/>
+          <w:sz w:val="20"/>
+          <w:szCs w:val="20"/>
+        </w:rPr>
+        <w:t>Dual use and ethics. The report shows how a hidden, format-conditional sabotage can be located, and the positive control shows that ordinary SFT on corrupted transcripts implants one. We judge the audit value higher than the risk: the recipe adds no new capability, the behaviour harms the deploying party rather than third parties, and the detection methods (role-contrast sweep, within-model battery, parse-failure and message-delivery logging) are the actionable contribution. No human subjects were involved; all models and data are public or released with this report.</w:t>
+      </w:r>
+    </w:p>
+    <w:p>
+      <w:pPr>
+        <w:spacing w:after="60"/>
+        <w:rPr>
+          <w:rFonts w:hint="default" w:ascii="Arial Regular" w:hAnsi="Arial Regular" w:cs="Arial Regular"/>
+          <w:sz w:val="20"/>
+          <w:szCs w:val="20"/>
+        </w:rPr>
+      </w:pPr>
+    </w:p>
+    <w:p>
+      <w:pPr>
+        <w:spacing w:after="60"/>
+        <w:rPr>
+          <w:rFonts w:hint="default" w:ascii="Arial Regular" w:hAnsi="Arial Regular" w:cs="Arial Regular"/>
+          <w:sz w:val="20"/>
+          <w:szCs w:val="20"/>
+        </w:rPr>
+      </w:pPr>
+      <w:r>
+        <w:rPr>
+          <w:rFonts w:hint="default" w:ascii="Arial Regular" w:hAnsi="Arial Regular" w:cs="Arial Regular"/>
+          <w:sz w:val="20"/>
+          <w:szCs w:val="20"/>
+          <w:lang w:val="en-US" w:eastAsia="zh-CN"/>
+        </w:rPr>
+        <w:t>Use of LLMs. This work was conducted in collaboration with Claude Code.</w:t>
+      </w:r>
+    </w:p>
+    <w:p>
+      <w:pPr>
+        <w:spacing w:after="60"/>
+        <w:rPr>
+          <w:rFonts w:hint="default" w:ascii="Arial Regular" w:hAnsi="Arial Regular" w:cs="Arial Regular"/>
+          <w:sz w:val="20"/>
+          <w:szCs w:val="20"/>
+        </w:rPr>
+      </w:pPr>
+      <w:bookmarkStart w:id="0" w:name="_GoBack"/>
+      <w:bookmarkEnd w:id="0"/>
     </w:p>
     <w:sectPr>
       <w:pgSz w:w="12240" w:h="15840"/>

</xml_diff>